<commit_message>
docs(report): remove iOS references and align the budget with EnergyMonitor
</commit_message>
<xml_diff>
--- a/Informe tecnico/INFORME TECNICO (1) (1).docx
+++ b/Informe tecnico/INFORME TECNICO (1) (1).docx
@@ -140,7 +140,7 @@
           <w:vertAlign w:val="baseline"/>
           <w:rtl w:val="0"/>
         </w:rPr>
-        <w:t xml:space="preserve">INFORME TECNICO MONITOR DE CONSUMO ELECTRICO</w:t>
+        <w:t>INFORME TECNICO EnergyMonitor</w:t>
       </w:r>
       <w:r>
         <w:rPr>
@@ -1937,7 +1937,7 @@
           <w:rFonts w:ascii="Arial" w:cs="Arial" w:eastAsia="Arial" w:hAnsi="Arial"/>
           <w:rtl w:val="0"/>
         </w:rPr>
-        <w:t xml:space="preserve"> El proyecto “Monitor de Consumo Eléctrico” surge como una iniciativa tecnológica orientada a promover el uso responsable y eficiente de la energía en los hogares colombianos. En la actualidad, muchas personas desconocen el comportamiento real de su consumo eléctrico, lo que genera altos costos en sus facturas y un impacto negativo en el medio ambiente. Ante esta problemática, se plantea el desarrollo de un sistema capaz de proporcionar información clara, precisa y en tiempo real sobre el gasto energético, facilitando la toma de decisiones informadas para reducir el consumo y fomentar hábitos sostenibles.</w:t>
+        <w:t xml:space="preserve"> El proyecto “EnergyMonitor” surge como una iniciativa tecnológica orientada a promover el uso responsable y eficiente de la energía en los hogares colombianos. En la actualidad, muchas personas desconocen el comportamiento real de su consumo eléctrico, lo que genera altos costos en sus facturas y un impacto negativo en el medio ambiente. Ante esta problemática, se plantea el desarrollo de un sistema capaz de proporcionar información clara, precisa y en tiempo real sobre el gasto energético, facilitando la toma de decisiones informadas para reducir el consumo y fomentar hábitos sostenibles.</w:t>
       </w:r>
     </w:p>
     <w:p>
@@ -1965,7 +1965,7 @@
           <w:rFonts w:ascii="Arial" w:cs="Arial" w:eastAsia="Arial" w:hAnsi="Arial"/>
           <w:rtl w:val="0"/>
         </w:rPr>
-        <w:t xml:space="preserve">Con un enfoque accesible y escalable, este proyecto no solo busca generar un beneficio económico en los hogares al disminuir los costos de la electricidad, sino también aportar al cuidado del medio ambiente mediante la reducción de desperdicios energéticos. En ese sentido, el Monitor de Consumo Eléctrico se concibe como una solución práctica, innovadora y con impacto social, alineada con los objetivos de sostenibilidad y transformación digital del país.</w:t>
+        <w:t>Con un enfoque accesible y escalable, este proyecto no solo busca generar un beneficio económico en los hogares al disminuir los costos de la electricidad, sino también aportar al cuidado del medio ambiente mediante la reducción de desperdicios energéticos. En ese sentido, el EnergyMonitor se concibe como una solución práctica, innovadora y con impacto social, alineada con los objetivos de sostenibilidad y transformación digital del país.</w:t>
       </w:r>
     </w:p>
     <w:p>
@@ -2023,7 +2023,7 @@
           <w:rFonts w:ascii="Arial" w:cs="Arial" w:eastAsia="Arial" w:hAnsi="Arial"/>
           <w:rtl w:val="0"/>
         </w:rPr>
-        <w:t xml:space="preserve">El proyecto “Monitor de Consumo Eléctrico” consiste en el desarrollo de un sistema digital integral que permita a los usuarios visualizar, analizar y gestionar en tiempo real el uso de energía eléctrica en sus hogares o instalaciones. La solución estará basada en la integración de sensores, un microcontrolador ESP32 y una aplicación móvil y web, con el propósito de brindar información clara y accesible sobre los hábitos de consumo, generar alertas ante excesos y ofrecer recomendaciones personalizadas.</w:t>
+        <w:t>El proyecto “EnergyMonitor” consiste en el desarrollo de un sistema digital integral que permita a los usuarios visualizar, analizar y gestionar en tiempo real el uso de energía eléctrica en sus hogares o instalaciones. La solución estará basada en la integración de sensores, un microcontrolador ESP32 y una aplicación móvil y web, con el propósito de brindar información clara y accesible sobre los hábitos de consumo, generar alertas ante excesos y ofrecer recomendaciones personalizadas.</w:t>
       </w:r>
     </w:p>
     <w:p>
@@ -2504,7 +2504,7 @@
           <w:vertAlign w:val="baseline"/>
           <w:rtl w:val="0"/>
         </w:rPr>
-        <w:t xml:space="preserve">Garantizar la compatibilidad del sistema con dispositivos móviles Android/iOS y navegadores web modernos, asegurando accesibilidad y usabilidad.</w:t>
+        <w:t>Garantizar la compatibilidad del sistema con dispositivos móviles Android y navegadores web modernos, asegurando accesibilidad y usabilidad.</w:t>
       </w:r>
     </w:p>
     <w:p>
@@ -3502,7 +3502,7 @@
           <w:rFonts w:ascii="Arial" w:cs="Arial" w:eastAsia="Arial" w:hAnsi="Arial"/>
           <w:rtl w:val="0"/>
         </w:rPr>
-        <w:t xml:space="preserve"> El plan de mantenimiento de la aplicación “Monitor de Consumo Eléctrico” está orientado a garantizar la continuidad operativa, seguridad y mejora continua del sistema. Se establecen tres modalidades principales:</w:t>
+        <w:t xml:space="preserve"> El plan de mantenimiento de la aplicación “EnergyMonitor” está orientado a garantizar la continuidad operativa, seguridad y mejora continua del sistema. Se establecen tres modalidades principales:</w:t>
       </w:r>
     </w:p>
     <w:p>
@@ -4153,7 +4153,7 @@
           <w:vertAlign w:val="baseline"/>
           <w:rtl w:val="0"/>
         </w:rPr>
-        <w:t xml:space="preserve">Adaptación a nuevas versiones de sistemas operativos (Android/iOS) y navegadores web.</w:t>
+        <w:t>Adaptación a nuevas versiones de sistemas operativos (Android) y navegadores web.</w:t>
       </w:r>
     </w:p>
     <w:p>
@@ -4554,6 +4554,8 @@
       </w:r>
     </w:p>
     <w:sectPr>
+      <w:headerReference w:type="default" r:id="rId10"/>
+      <w:footerReference w:type="default" r:id="rId11"/>
       <w:pgSz w:h="15840" w:w="12240" w:orient="portrait"/>
       <w:pgMar w:bottom="1417" w:top="1417" w:left="1701" w:right="1701" w:header="708" w:footer="708"/>
       <w:pgNumType w:start="0"/>
@@ -4561,6 +4563,26 @@
     </w:sectPr>
   </w:body>
 </w:document>
+</file>
+
+<file path=word/footer1.xml><?xml version="1.0" encoding="utf-8"?>
+<w:ftr xmlns:m="http://schemas.openxmlformats.org/officeDocument/2006/math" xmlns:mc="http://schemas.openxmlformats.org/markup-compatibility/2006" xmlns:mo="http://schemas.microsoft.com/office/mac/office/2008/main" xmlns:mv="urn:schemas-microsoft-com:mac:vml" xmlns:o="urn:schemas-microsoft-com:office:office" xmlns:r="http://schemas.openxmlformats.org/officeDocument/2006/relationships" xmlns:v="urn:schemas-microsoft-com:vml" xmlns:w10="urn:schemas-microsoft-com:office:word" xmlns:w14="http://schemas.microsoft.com/office/word/2010/wordml" xmlns:w="http://schemas.openxmlformats.org/wordprocessingml/2006/main" xmlns:wne="http://schemas.microsoft.com/office/word/2006/wordml" xmlns:wp14="http://schemas.microsoft.com/office/word/2010/wordprocessingDrawing" xmlns:wp="http://schemas.openxmlformats.org/drawingml/2006/wordprocessingDrawing" xmlns:wpc="http://schemas.microsoft.com/office/word/2010/wordprocessingCanvas" xmlns:wpg="http://schemas.microsoft.com/office/word/2010/wordprocessingGroup" xmlns:wpi="http://schemas.microsoft.com/office/word/2010/wordprocessingInk" xmlns:wps="http://schemas.microsoft.com/office/word/2010/wordprocessingShape" mc:Ignorable="w14 wp14">
+  <w:p>
+    <w:pPr>
+      <w:pStyle w:val="Footer"/>
+    </w:pPr>
+  </w:p>
+</w:ftr>
+</file>
+
+<file path=word/header1.xml><?xml version="1.0" encoding="utf-8"?>
+<w:hdr xmlns:m="http://schemas.openxmlformats.org/officeDocument/2006/math" xmlns:mc="http://schemas.openxmlformats.org/markup-compatibility/2006" xmlns:mo="http://schemas.microsoft.com/office/mac/office/2008/main" xmlns:mv="urn:schemas-microsoft-com:mac:vml" xmlns:o="urn:schemas-microsoft-com:office:office" xmlns:r="http://schemas.openxmlformats.org/officeDocument/2006/relationships" xmlns:v="urn:schemas-microsoft-com:vml" xmlns:w10="urn:schemas-microsoft-com:office:word" xmlns:w14="http://schemas.microsoft.com/office/word/2010/wordml" xmlns:w="http://schemas.openxmlformats.org/wordprocessingml/2006/main" xmlns:wne="http://schemas.microsoft.com/office/word/2006/wordml" xmlns:wp14="http://schemas.microsoft.com/office/word/2010/wordprocessingDrawing" xmlns:wp="http://schemas.openxmlformats.org/drawingml/2006/wordprocessingDrawing" xmlns:wpc="http://schemas.microsoft.com/office/word/2010/wordprocessingCanvas" xmlns:wpg="http://schemas.microsoft.com/office/word/2010/wordprocessingGroup" xmlns:wpi="http://schemas.microsoft.com/office/word/2010/wordprocessingInk" xmlns:wps="http://schemas.microsoft.com/office/word/2010/wordprocessingShape" mc:Ignorable="w14 wp14">
+  <w:p>
+    <w:pPr>
+      <w:pStyle w:val="Header"/>
+    </w:pPr>
+  </w:p>
+</w:hdr>
 </file>
 
 <file path=word/numbering.xml><?xml version="1.0" encoding="utf-8"?>

</xml_diff>